<commit_message>
introducing computational poetics and the PSMC analyst
</commit_message>
<xml_diff>
--- a/docs/TAZ_BOOK/TAZ_BOOK_latex/resources/pdfs/FrontisMatter.docx
+++ b/docs/TAZ_BOOK/TAZ_BOOK_latex/resources/pdfs/FrontisMatter.docx
@@ -708,6 +708,99 @@
         </w:rPr>
         <w:t>NOVUS MODERNUS GRIMOIRE LUMTAUTO</w:t>
       </w:r>
+    </w:p>
+    <w:p>
+      <w:pPr>
+        <w:jc w:val="center"/>
+        <w:rPr>
+          <w:rFonts w:ascii="Libre Baskerville" w:hAnsi="Libre Baskerville"/>
+          <w:i/>
+        </w:rPr>
+      </w:pPr>
+    </w:p>
+    <w:p>
+      <w:pPr>
+        <w:jc w:val="center"/>
+        <w:rPr>
+          <w:rFonts w:ascii="Libre Baskerville" w:hAnsi="Libre Baskerville"/>
+          <w:i/>
+        </w:rPr>
+      </w:pPr>
+    </w:p>
+    <w:p>
+      <w:pPr>
+        <w:jc w:val="center"/>
+        <w:rPr>
+          <w:rFonts w:ascii="Libre Baskerville" w:hAnsi="Libre Baskerville"/>
+          <w:i/>
+        </w:rPr>
+      </w:pPr>
+      <w:r>
+        <w:rPr>
+          <w:rFonts w:ascii="Libre Baskerville" w:hAnsi="Libre Baskerville"/>
+          <w:i/>
+        </w:rPr>
+        <w:t>JWL's Chronological Literary Review of Daniel Defoe's Robinson Crusoe (1719)</w:t>
+      </w:r>
+    </w:p>
+    <w:p>
+      <w:pPr>
+        <w:jc w:val="center"/>
+        <w:rPr>
+          <w:rFonts w:ascii="Libre Baskerville" w:hAnsi="Libre Baskerville"/>
+          <w:i/>
+        </w:rPr>
+      </w:pPr>
+    </w:p>
+    <w:p>
+      <w:pPr>
+        <w:jc w:val="center"/>
+        <w:rPr>
+          <w:rFonts w:ascii="Libre Baskerville" w:hAnsi="Libre Baskerville"/>
+          <w:i/>
+        </w:rPr>
+      </w:pPr>
+    </w:p>
+    <w:p>
+      <w:pPr>
+        <w:jc w:val="center"/>
+        <w:rPr>
+          <w:rFonts w:ascii="Libre Baskerville" w:hAnsi="Libre Baskerville"/>
+          <w:i/>
+        </w:rPr>
+      </w:pPr>
+      <w:r>
+        <w:rPr>
+          <w:rFonts w:ascii="Libre Baskerville" w:hAnsi="Libre Baskerville"/>
+          <w:i/>
+        </w:rPr>
+        <w:t xml:space="preserve">Masonic Construction: Perfect Pentagon or Pentagram (The Masonic </w:t>
+      </w:r>
+      <w:proofErr w:type="spellStart"/>
+      <w:r>
+        <w:rPr>
+          <w:rFonts w:ascii="Libre Baskerville" w:hAnsi="Libre Baskerville"/>
+          <w:i/>
+        </w:rPr>
+        <w:t>Pentalpha</w:t>
+      </w:r>
+      <w:proofErr w:type="spellEnd"/>
+      <w:r>
+        <w:rPr>
+          <w:rFonts w:ascii="Libre Baskerville" w:hAnsi="Libre Baskerville"/>
+          <w:i/>
+        </w:rPr>
+        <w:t xml:space="preserve"> Method)</w:t>
+      </w:r>
+    </w:p>
+    <w:p>
+      <w:pPr>
+        <w:jc w:val="center"/>
+        <w:rPr>
+          <w:rFonts w:ascii="Libre Baskerville" w:hAnsi="Libre Baskerville"/>
+          <w:i/>
+        </w:rPr>
+      </w:pPr>
     </w:p>
     <w:p>
       <w:r>
@@ -1472,18 +1565,18 @@
           <w:b/>
           <w:color w:val="7030A0"/>
         </w:rPr>
-        <w:t>6 May</w:t>
+        <w:t>10 Aug</w:t>
+      </w:r>
+      <w:r>
+        <w:rPr>
+          <w:rFonts w:ascii="Libre Baskerville" w:hAnsi="Libre Baskerville"/>
+          <w:b/>
+          <w:color w:val="7030A0"/>
+        </w:rPr>
+        <w:t xml:space="preserve"> 2026</w:t>
       </w:r>
       <w:bookmarkStart w:id="0" w:name="_GoBack"/>
       <w:bookmarkEnd w:id="0"/>
-      <w:r>
-        <w:rPr>
-          <w:rFonts w:ascii="Libre Baskerville" w:hAnsi="Libre Baskerville"/>
-          <w:b/>
-          <w:color w:val="7030A0"/>
-        </w:rPr>
-        <w:t xml:space="preserve"> 2026</w:t>
-      </w:r>
     </w:p>
     <w:p/>
     <w:p>

</xml_diff>

<commit_message>
latest TEA TAZ ready
</commit_message>
<xml_diff>
--- a/docs/TAZ_BOOK/TAZ_BOOK_latex/resources/pdfs/FrontisMatter.docx
+++ b/docs/TAZ_BOOK/TAZ_BOOK_latex/resources/pdfs/FrontisMatter.docx
@@ -423,12 +423,21 @@
           <w:i/>
         </w:rPr>
       </w:pPr>
-      <w:r>
-        <w:rPr>
-          <w:rFonts w:ascii="Libre Baskerville" w:hAnsi="Libre Baskerville"/>
-          <w:i/>
-        </w:rPr>
-        <w:t xml:space="preserve">Embaga Ku </w:t>
+      <w:proofErr w:type="spellStart"/>
+      <w:r>
+        <w:rPr>
+          <w:rFonts w:ascii="Libre Baskerville" w:hAnsi="Libre Baskerville"/>
+          <w:i/>
+        </w:rPr>
+        <w:t>Embaga</w:t>
+      </w:r>
+      <w:proofErr w:type="spellEnd"/>
+      <w:r>
+        <w:rPr>
+          <w:rFonts w:ascii="Libre Baskerville" w:hAnsi="Libre Baskerville"/>
+          <w:i/>
+        </w:rPr>
+        <w:t xml:space="preserve"> Ku </w:t>
       </w:r>
       <w:proofErr w:type="spellStart"/>
       <w:r>
@@ -1543,40 +1552,59 @@
         </w:rPr>
         <w:t>, 2025</w:t>
       </w:r>
-    </w:p>
-    <w:p>
-      <w:pPr>
-        <w:ind w:left="360"/>
-        <w:jc w:val="center"/>
-        <w:rPr>
-          <w:color w:val="7030A0"/>
-        </w:rPr>
-      </w:pPr>
-      <w:r>
-        <w:rPr>
-          <w:rFonts w:ascii="Libre Baskerville" w:hAnsi="Libre Baskerville"/>
-          <w:b/>
-        </w:rPr>
-        <w:t xml:space="preserve">Latest Revision: </w:t>
-      </w:r>
-      <w:r>
-        <w:rPr>
-          <w:rFonts w:ascii="Libre Baskerville" w:hAnsi="Libre Baskerville"/>
-          <w:b/>
-          <w:color w:val="7030A0"/>
-        </w:rPr>
-        <w:t>10 Aug</w:t>
-      </w:r>
-      <w:r>
-        <w:rPr>
-          <w:rFonts w:ascii="Libre Baskerville" w:hAnsi="Libre Baskerville"/>
-          <w:b/>
-          <w:color w:val="7030A0"/>
-        </w:rPr>
-        <w:t xml:space="preserve"> 2026</w:t>
-      </w:r>
       <w:bookmarkStart w:id="0" w:name="_GoBack"/>
       <w:bookmarkEnd w:id="0"/>
+    </w:p>
+    <w:p>
+      <w:pPr>
+        <w:ind w:left="360"/>
+        <w:jc w:val="center"/>
+        <w:rPr>
+          <w:color w:val="7030A0"/>
+        </w:rPr>
+      </w:pPr>
+      <w:r>
+        <w:rPr>
+          <w:rFonts w:ascii="Libre Baskerville" w:hAnsi="Libre Baskerville"/>
+          <w:b/>
+        </w:rPr>
+        <w:t xml:space="preserve">Latest Revision: </w:t>
+      </w:r>
+      <w:proofErr w:type="gramStart"/>
+      <w:r>
+        <w:rPr>
+          <w:rFonts w:ascii="Libre Baskerville" w:hAnsi="Libre Baskerville"/>
+          <w:b/>
+          <w:color w:val="7030A0"/>
+        </w:rPr>
+        <w:t>2</w:t>
+      </w:r>
+      <w:r>
+        <w:rPr>
+          <w:rFonts w:ascii="Libre Baskerville" w:hAnsi="Libre Baskerville"/>
+          <w:b/>
+          <w:color w:val="7030A0"/>
+          <w:vertAlign w:val="superscript"/>
+        </w:rPr>
+        <w:t>nd</w:t>
+      </w:r>
+      <w:proofErr w:type="gramEnd"/>
+      <w:r>
+        <w:rPr>
+          <w:rFonts w:ascii="Libre Baskerville" w:hAnsi="Libre Baskerville"/>
+          <w:b/>
+          <w:color w:val="7030A0"/>
+        </w:rPr>
+        <w:t xml:space="preserve"> Sept</w:t>
+      </w:r>
+      <w:r>
+        <w:rPr>
+          <w:rFonts w:ascii="Libre Baskerville" w:hAnsi="Libre Baskerville"/>
+          <w:b/>
+          <w:color w:val="7030A0"/>
+        </w:rPr>
+        <w:t xml:space="preserve"> 2026</w:t>
+      </w:r>
     </w:p>
     <w:p/>
     <w:p>

</xml_diff>